<commit_message>
Deploy preview for PR 29 🛫
</commit_message>
<xml_diff>
--- a/pr-preview/pr-29/chapters/chapter2-tracked-changes.docx
+++ b/pr-preview/pr-29/chapters/chapter2-tracked-changes.docx
@@ -18,7 +18,7 @@
         <w:t xml:space="preserve">This is the second chapter. Continue building your website with more chapters.</w:t>
       </w:r>
     </w:p>
-    <w:bookmarkStart w:id="9" w:name="mathematical-equations"/>
+    <w:bookmarkStart w:id="10" w:name="mathematical-equations"/>
     <w:p>
       <w:pPr>
         <w:pStyle w:val="Heading1"/>
@@ -84,6 +84,7 @@
       <w:pPr>
         <w:pStyle w:val="BodyText"/>
       </w:pPr>
+      <w:bookmarkStart w:id="9" w:name="eq-gaussian-integral"/>
       <m:oMathPara>
         <m:oMathParaPr>
           <m:jc m:val="center"/>
@@ -171,11 +172,58 @@
               </m:r>
             </m:e>
           </m:rad>
+          <m:r>
+            <m:t>  </m:t>
+          </m:r>
+          <m:r>
+            <m:rPr>
+              <m:sty m:val="p"/>
+            </m:rPr>
+            <m:t>(</m:t>
+          </m:r>
+          <m:r>
+            <m:t>1</m:t>
+          </m:r>
+          <m:r>
+            <m:rPr>
+              <m:sty m:val="p"/>
+            </m:rPr>
+            <m:t>)</m:t>
+          </m:r>
         </m:oMath>
       </m:oMathPara>
+      <w:bookmarkEnd w:id="9"/>
     </w:p>
-    <w:bookmarkEnd w:id="9"/>
-    <w:bookmarkStart w:id="11" w:name="tables"/>
+    <w:p>
+      <w:pPr>
+        <w:pStyle w:val="FirstParagraph"/>
+      </w:pPr>
+      <w:r>
+        <w:t xml:space="preserve">Direct link to the equation anchor:</w:t>
+      </w:r>
+      <w:r>
+        <w:t xml:space="preserve"> </w:t>
+      </w:r>
+      <w:r>
+        <w:t xml:space="preserve">See</w:t>
+      </w:r>
+      <w:r>
+        <w:t xml:space="preserve"> </w:t>
+      </w:r>
+      <w:hyperlink w:anchor="eq-gaussian-integral">
+        <w:r>
+          <w:rPr>
+            <w:rStyle w:val="Hyperlink"/>
+          </w:rPr>
+          <w:t xml:space="preserve">Equation 1</w:t>
+        </w:r>
+      </w:hyperlink>
+      <w:r>
+        <w:t xml:space="preserve">.</w:t>
+      </w:r>
+    </w:p>
+    <w:bookmarkEnd w:id="10"/>
+    <w:bookmarkStart w:id="12" w:name="tables"/>
     <w:p>
       <w:pPr>
         <w:pStyle w:val="Heading1"/>
@@ -197,7 +245,7 @@
       <w:tr>
         <w:tc>
           <w:tcPr/>
-          <w:bookmarkStart w:id="10" w:name="tbl-example"/>
+          <w:bookmarkStart w:id="11" w:name="tbl-example"/>
           <w:p>
             <w:pPr>
               <w:jc w:val="center"/>
@@ -340,13 +388,13 @@
               </w:tc>
             </w:tr>
           </w:tbl>
-          <w:bookmarkEnd w:id="10"/>
+          <w:bookmarkEnd w:id="11"/>
           <w:p/>
         </w:tc>
       </w:tr>
     </w:tbl>
-    <w:bookmarkEnd w:id="11"/>
-    <w:bookmarkStart w:id="12" w:name="figures"/>
+    <w:bookmarkEnd w:id="12"/>
+    <w:bookmarkStart w:id="13" w:name="figures"/>
     <w:p>
       <w:pPr>
         <w:pStyle w:val="Heading1"/>
@@ -415,8 +463,8 @@
         <w:t xml:space="preserve">.</w:t>
       </w:r>
     </w:p>
-    <w:bookmarkEnd w:id="12"/>
-    <w:bookmarkStart w:id="25" w:name="callouts"/>
+    <w:bookmarkEnd w:id="13"/>
+    <w:bookmarkStart w:id="26" w:name="callouts"/>
     <w:p>
       <w:pPr>
         <w:pStyle w:val="Heading1"/>
@@ -466,18 +514,18 @@
                 <wp:inline>
                   <wp:extent cx="152400" cy="152400"/>
                   <wp:effectExtent b="0" l="0" r="0" t="0"/>
-                  <wp:docPr descr="" title="" id="14" name="Picture"/>
+                  <wp:docPr descr="" title="" id="15" name="Picture"/>
                   <a:graphic>
                     <a:graphicData uri="http://schemas.openxmlformats.org/drawingml/2006/picture">
                       <pic:pic>
                         <pic:nvPicPr>
-                          <pic:cNvPr descr="/opt/quarto/share/formats/docx/note.png" id="15" name="Picture"/>
+                          <pic:cNvPr descr="/opt/quarto/share/formats/docx/note.png" id="16" name="Picture"/>
                           <pic:cNvPicPr>
                             <a:picLocks noChangeArrowheads="1" noChangeAspect="1"/>
                           </pic:cNvPicPr>
                         </pic:nvPicPr>
                         <pic:blipFill>
-                          <a:blip r:embed="rId13"/>
+                          <a:blip r:embed="rId14"/>
                           <a:stretch>
                             <a:fillRect/>
                           </a:stretch>
@@ -590,18 +638,18 @@
                 <wp:inline>
                   <wp:extent cx="152400" cy="152400"/>
                   <wp:effectExtent b="0" l="0" r="0" t="0"/>
-                  <wp:docPr descr="" title="" id="17" name="Picture"/>
+                  <wp:docPr descr="" title="" id="18" name="Picture"/>
                   <a:graphic>
                     <a:graphicData uri="http://schemas.openxmlformats.org/drawingml/2006/picture">
                       <pic:pic>
                         <pic:nvPicPr>
-                          <pic:cNvPr descr="/opt/quarto/share/formats/docx/tip.png" id="18" name="Picture"/>
+                          <pic:cNvPr descr="/opt/quarto/share/formats/docx/tip.png" id="19" name="Picture"/>
                           <pic:cNvPicPr>
                             <a:picLocks noChangeArrowheads="1" noChangeAspect="1"/>
                           </pic:cNvPicPr>
                         </pic:nvPicPr>
                         <pic:blipFill>
-                          <a:blip r:embed="rId16"/>
+                          <a:blip r:embed="rId17"/>
                           <a:stretch>
                             <a:fillRect/>
                           </a:stretch>
@@ -714,18 +762,18 @@
                 <wp:inline>
                   <wp:extent cx="152400" cy="152400"/>
                   <wp:effectExtent b="0" l="0" r="0" t="0"/>
-                  <wp:docPr descr="" title="" id="20" name="Picture"/>
+                  <wp:docPr descr="" title="" id="21" name="Picture"/>
                   <a:graphic>
                     <a:graphicData uri="http://schemas.openxmlformats.org/drawingml/2006/picture">
                       <pic:pic>
                         <pic:nvPicPr>
-                          <pic:cNvPr descr="/opt/quarto/share/formats/docx/warning.png" id="21" name="Picture"/>
+                          <pic:cNvPr descr="/opt/quarto/share/formats/docx/warning.png" id="22" name="Picture"/>
                           <pic:cNvPicPr>
                             <a:picLocks noChangeArrowheads="1" noChangeAspect="1"/>
                           </pic:cNvPicPr>
                         </pic:nvPicPr>
                         <pic:blipFill>
-                          <a:blip r:embed="rId19"/>
+                          <a:blip r:embed="rId20"/>
                           <a:stretch>
                             <a:fillRect/>
                           </a:stretch>
@@ -838,18 +886,18 @@
                 <wp:inline>
                   <wp:extent cx="152400" cy="152400"/>
                   <wp:effectExtent b="0" l="0" r="0" t="0"/>
-                  <wp:docPr descr="" title="" id="23" name="Picture"/>
+                  <wp:docPr descr="" title="" id="24" name="Picture"/>
                   <a:graphic>
                     <a:graphicData uri="http://schemas.openxmlformats.org/drawingml/2006/picture">
                       <pic:pic>
                         <pic:nvPicPr>
-                          <pic:cNvPr descr="/opt/quarto/share/formats/docx/important.png" id="24" name="Picture"/>
+                          <pic:cNvPr descr="/opt/quarto/share/formats/docx/important.png" id="25" name="Picture"/>
                           <pic:cNvPicPr>
                             <a:picLocks noChangeArrowheads="1" noChangeAspect="1"/>
                           </pic:cNvPicPr>
                         </pic:nvPicPr>
                         <pic:blipFill>
-                          <a:blip r:embed="rId22"/>
+                          <a:blip r:embed="rId23"/>
                           <a:stretch>
                             <a:fillRect/>
                           </a:stretch>
@@ -913,8 +961,8 @@
         </w:tc>
       </w:tr>
     </w:tbl>
-    <w:bookmarkEnd w:id="25"/>
-    <w:bookmarkStart w:id="27" w:name="references"/>
+    <w:bookmarkEnd w:id="26"/>
+    <w:bookmarkStart w:id="28" w:name="references"/>
     <w:p>
       <w:pPr>
         <w:pStyle w:val="Heading1"/>
@@ -923,9 +971,9 @@
         <w:t xml:space="preserve">References</w:t>
       </w:r>
     </w:p>
-    <w:bookmarkStart w:id="26" w:name="refs"/>
-    <w:bookmarkEnd w:id="26"/>
+    <w:bookmarkStart w:id="27" w:name="refs"/>
     <w:bookmarkEnd w:id="27"/>
+    <w:bookmarkEnd w:id="28"/>
     <w:sectPr>
       <w:footnotePr>
         <w:numRestart w:val="eachSect"/>

</xml_diff>